<commit_message>
chore: actualizar templates y agregar unidad GAL
Made-with: Cursor
</commit_message>
<xml_diff>
--- a/backend/templates/checklist_template.docx
+++ b/backend/templates/checklist_template.docx
@@ -2395,6 +2395,1731 @@
         </w:rPr>
         <w:t>Fecha: __________________</w:t>
       </w:r>
+    </w:p>
+    <w:p>
+      <w:pPr>
+        <w:pStyle w:val="Body"/>
+        <w:spacing w:line="360" w:lineRule="auto"/>
+      </w:pPr>
+    </w:p>
+    <w:p>
+      <w:pPr>
+        <w:pStyle w:val="Body"/>
+        <w:spacing w:line="360" w:lineRule="auto"/>
+      </w:pPr>
+    </w:p>
+    <w:p>
+      <w:pPr>
+        <w:pStyle w:val="Body"/>
+        <w:spacing w:line="360" w:lineRule="auto"/>
+      </w:pPr>
+    </w:p>
+    <w:p>
+      <w:pPr>
+        <w:pStyle w:val="Body"/>
+        <w:spacing w:line="360" w:lineRule="auto"/>
+      </w:pPr>
+    </w:p>
+    <w:p>
+      <w:pPr>
+        <w:pStyle w:val="Body"/>
+        <w:spacing w:line="360" w:lineRule="auto"/>
+      </w:pPr>
+    </w:p>
+    <w:p>
+      <w:pPr>
+        <w:pStyle w:val="Body"/>
+        <w:spacing w:line="360" w:lineRule="auto"/>
+      </w:pPr>
+    </w:p>
+    <w:p>
+      <w:pPr>
+        <w:pStyle w:val="Body"/>
+        <w:spacing w:line="360" w:lineRule="auto"/>
+      </w:pPr>
+    </w:p>
+    <w:p>
+      <w:pPr>
+        <w:pStyle w:val="Body"/>
+        <w:spacing w:line="360" w:lineRule="auto"/>
+      </w:pPr>
+    </w:p>
+    <w:p>
+      <w:pPr>
+        <w:pStyle w:val="Default"/>
+        <w:suppressAutoHyphens w:val="1"/>
+        <w:spacing w:before="0" w:after="240" w:line="240" w:lineRule="auto"/>
+        <w:jc w:val="center"/>
+        <w:rPr>
+          <w:rFonts w:ascii="Times Roman" w:cs="Times Roman" w:hAnsi="Times Roman" w:eastAsia="Times Roman"/>
+          <w:b w:val="1"/>
+          <w:bCs w:val="1"/>
+        </w:rPr>
+      </w:pPr>
+      <w:r>
+        <w:rPr>
+          <w:rFonts w:ascii="Times Roman" w:hAnsi="Times Roman"/>
+          <w:rtl w:val="0"/>
+          <w:lang w:val="de-DE"/>
+        </w:rPr>
+        <w:t>ZAS BY JMC CORP</w:t>
+      </w:r>
+      <w:r>
+        <w:rPr>
+          <w:rFonts w:ascii="Times Roman" w:cs="Times Roman" w:hAnsi="Times Roman" w:eastAsia="Times Roman"/>
+        </w:rPr>
+        <w:br w:type="textWrapping"/>
+      </w:r>
+      <w:r>
+        <w:rPr>
+          <w:rFonts w:ascii="Times Roman" w:hAnsi="Times Roman"/>
+          <w:rtl w:val="0"/>
+          <w:lang w:val="de-DE"/>
+        </w:rPr>
+        <w:t>7081 NW 82nd Ave</w:t>
+      </w:r>
+      <w:r>
+        <w:rPr>
+          <w:rFonts w:ascii="Times Roman" w:cs="Times Roman" w:hAnsi="Times Roman" w:eastAsia="Times Roman"/>
+        </w:rPr>
+        <w:br w:type="textWrapping"/>
+      </w:r>
+      <w:r>
+        <w:rPr>
+          <w:rFonts w:ascii="Times Roman" w:hAnsi="Times Roman"/>
+          <w:b w:val="1"/>
+          <w:bCs w:val="1"/>
+          <w:rtl w:val="0"/>
+          <w:lang w:val="de-DE"/>
+        </w:rPr>
+        <w:t>Miami, FL 33166</w:t>
+      </w:r>
+    </w:p>
+    <w:p>
+      <w:pPr>
+        <w:pStyle w:val="Default"/>
+        <w:suppressAutoHyphens w:val="1"/>
+        <w:spacing w:before="0" w:after="240" w:line="240" w:lineRule="auto"/>
+        <w:jc w:val="center"/>
+        <w:rPr>
+          <w:rFonts w:ascii="Times Roman" w:cs="Times Roman" w:hAnsi="Times Roman" w:eastAsia="Times Roman"/>
+          <w:b w:val="1"/>
+          <w:bCs w:val="1"/>
+        </w:rPr>
+      </w:pPr>
+      <w:r>
+        <w:rPr>
+          <w:rFonts w:ascii="Times Roman" w:hAnsi="Times Roman"/>
+          <w:b w:val="1"/>
+          <w:bCs w:val="1"/>
+          <w:rtl w:val="0"/>
+          <w:lang w:val="de-DE"/>
+        </w:rPr>
+        <w:t xml:space="preserve">CHECKLIST </w:t>
+      </w:r>
+      <w:r>
+        <w:rPr>
+          <w:rFonts w:ascii="Times Roman" w:hAnsi="Times Roman" w:hint="default"/>
+          <w:b w:val="1"/>
+          <w:bCs w:val="1"/>
+          <w:rtl w:val="0"/>
+          <w:lang w:val="de-DE"/>
+        </w:rPr>
+        <w:t xml:space="preserve">– </w:t>
+      </w:r>
+      <w:r>
+        <w:rPr>
+          <w:rFonts w:ascii="Times Roman" w:hAnsi="Times Roman"/>
+          <w:b w:val="1"/>
+          <w:bCs w:val="1"/>
+          <w:rtl w:val="0"/>
+          <w:lang w:val="de-DE"/>
+        </w:rPr>
+        <w:t>COMMERCIAL EXPORT OPERATION</w:t>
+      </w:r>
+    </w:p>
+    <w:p>
+      <w:pPr>
+        <w:pStyle w:val="Default"/>
+        <w:suppressAutoHyphens w:val="1"/>
+        <w:spacing w:before="0" w:after="240" w:line="240" w:lineRule="auto"/>
+        <w:jc w:val="left"/>
+        <w:rPr>
+          <w:rFonts w:ascii="Times Roman" w:cs="Times Roman" w:hAnsi="Times Roman" w:eastAsia="Times Roman"/>
+        </w:rPr>
+      </w:pPr>
+      <w:r>
+        <w:rPr>
+          <w:rFonts w:ascii="Times Roman" w:hAnsi="Times Roman"/>
+          <w:rtl w:val="0"/>
+          <w:lang w:val="de-DE"/>
+        </w:rPr>
+        <w:t>Date: [[fecha]]</w:t>
+      </w:r>
+      <w:r>
+        <w:rPr>
+          <w:rFonts w:ascii="Times Roman" w:cs="Times Roman" w:hAnsi="Times Roman" w:eastAsia="Times Roman"/>
+        </w:rPr>
+        <w:br w:type="textWrapping"/>
+      </w:r>
+      <w:r>
+        <w:rPr>
+          <w:rFonts w:ascii="Times Roman" w:hAnsi="Times Roman"/>
+          <w:rtl w:val="0"/>
+          <w:lang w:val="de-DE"/>
+        </w:rPr>
+        <w:t>Operation Number: [[numero_oferta]]</w:t>
+      </w:r>
+      <w:r>
+        <w:rPr>
+          <w:rFonts w:ascii="Times Roman" w:cs="Times Roman" w:hAnsi="Times Roman" w:eastAsia="Times Roman"/>
+        </w:rPr>
+        <w:br w:type="textWrapping"/>
+      </w:r>
+      <w:r>
+        <w:rPr>
+          <w:rFonts w:ascii="Times Roman" w:hAnsi="Times Roman"/>
+          <w:rtl w:val="0"/>
+          <w:lang w:val="de-DE"/>
+        </w:rPr>
+        <w:t>Client / End User: [[nombre_cliente]]</w:t>
+      </w:r>
+      <w:r>
+        <w:rPr>
+          <w:rFonts w:ascii="Times Roman" w:cs="Times Roman" w:hAnsi="Times Roman" w:eastAsia="Times Roman"/>
+        </w:rPr>
+        <w:br w:type="textWrapping"/>
+      </w:r>
+      <w:r>
+        <w:rPr>
+          <w:rFonts w:ascii="Times Roman" w:hAnsi="Times Roman"/>
+          <w:rtl w:val="0"/>
+          <w:lang w:val="de-DE"/>
+        </w:rPr>
+        <w:t>Destination: Cuba</w:t>
+      </w:r>
+    </w:p>
+    <w:p>
+      <w:pPr>
+        <w:pStyle w:val="Default"/>
+        <w:suppressAutoHyphens w:val="1"/>
+        <w:spacing w:before="0" w:after="240" w:line="240" w:lineRule="auto"/>
+        <w:jc w:val="left"/>
+        <w:rPr>
+          <w:rFonts w:ascii="Times Roman" w:cs="Times Roman" w:hAnsi="Times Roman" w:eastAsia="Times Roman"/>
+        </w:rPr>
+      </w:pPr>
+      <w:r>
+        <w:rPr>
+          <w:rFonts w:ascii="Times Roman" w:hAnsi="Times Roman"/>
+          <w:b w:val="1"/>
+          <w:bCs w:val="1"/>
+          <w:rtl w:val="0"/>
+          <w:lang w:val="de-DE"/>
+        </w:rPr>
+        <w:t>IDENTIFICATION OF THE OPERATION</w:t>
+      </w:r>
+      <w:r>
+        <w:rPr>
+          <w:rFonts w:ascii="Times Roman" w:cs="Times Roman" w:hAnsi="Times Roman" w:eastAsia="Times Roman"/>
+        </w:rPr>
+        <w:br w:type="textWrapping"/>
+      </w:r>
+      <w:r>
+        <w:rPr>
+          <w:rFonts w:ascii="Times Roman" w:hAnsi="Times Roman"/>
+          <w:rtl w:val="0"/>
+          <w:lang w:val="de-DE"/>
+        </w:rPr>
+        <w:t>Country of Origin: X USA _ Panama _ Spain _ Mexico _ China _ Other: __________</w:t>
+      </w:r>
+      <w:r>
+        <w:rPr>
+          <w:rFonts w:ascii="Times Roman" w:cs="Times Roman" w:hAnsi="Times Roman" w:eastAsia="Times Roman"/>
+        </w:rPr>
+        <w:br w:type="textWrapping"/>
+      </w:r>
+      <w:r>
+        <w:rPr>
+          <w:rFonts w:ascii="Times Roman" w:hAnsi="Times Roman"/>
+          <w:rtl w:val="0"/>
+          <w:lang w:val="de-DE"/>
+        </w:rPr>
+        <w:t>Modality: Commercial Export (NO parcel shipment)</w:t>
+      </w:r>
+    </w:p>
+    <w:p>
+      <w:pPr>
+        <w:pStyle w:val="Default"/>
+        <w:suppressAutoHyphens w:val="1"/>
+        <w:spacing w:before="0" w:after="240" w:line="240" w:lineRule="auto"/>
+        <w:jc w:val="left"/>
+        <w:rPr>
+          <w:rFonts w:ascii="Times Roman" w:cs="Times Roman" w:hAnsi="Times Roman" w:eastAsia="Times Roman"/>
+        </w:rPr>
+      </w:pPr>
+      <w:r>
+        <w:rPr>
+          <w:rFonts w:ascii="Times Roman" w:hAnsi="Times Roman"/>
+          <w:rtl w:val="0"/>
+          <w:lang w:val="de-DE"/>
+        </w:rPr>
+        <w:t>X Client / shipper identified</w:t>
+      </w:r>
+      <w:r>
+        <w:rPr>
+          <w:rFonts w:ascii="Times Roman" w:cs="Times Roman" w:hAnsi="Times Roman" w:eastAsia="Times Roman"/>
+        </w:rPr>
+        <w:br w:type="textWrapping"/>
+      </w:r>
+      <w:r>
+        <w:rPr>
+          <w:rFonts w:ascii="Times Roman" w:hAnsi="Times Roman"/>
+          <w:rtl w:val="0"/>
+          <w:lang w:val="de-DE"/>
+        </w:rPr>
+        <w:t>ZAS BY JMC CORP: X Agent Seller _Courier _ Freight Forwarder _ Filing</w:t>
+      </w:r>
+    </w:p>
+    <w:p>
+      <w:pPr>
+        <w:pStyle w:val="Default"/>
+        <w:suppressAutoHyphens w:val="1"/>
+        <w:spacing w:before="0" w:after="240" w:line="240" w:lineRule="auto"/>
+        <w:jc w:val="left"/>
+        <w:rPr>
+          <w:rFonts w:ascii="Times Roman" w:cs="Times Roman" w:hAnsi="Times Roman" w:eastAsia="Times Roman"/>
+        </w:rPr>
+      </w:pPr>
+      <w:r>
+        <w:rPr>
+          <w:rFonts w:ascii="Times Roman" w:hAnsi="Times Roman"/>
+          <w:b w:val="1"/>
+          <w:bCs w:val="1"/>
+          <w:rtl w:val="0"/>
+          <w:lang w:val="de-DE"/>
+        </w:rPr>
+        <w:t xml:space="preserve">CLIENT / END USER (KYC </w:t>
+      </w:r>
+      <w:r>
+        <w:rPr>
+          <w:rFonts w:ascii="Times Roman" w:hAnsi="Times Roman" w:hint="default"/>
+          <w:b w:val="1"/>
+          <w:bCs w:val="1"/>
+          <w:rtl w:val="0"/>
+          <w:lang w:val="de-DE"/>
+        </w:rPr>
+        <w:t xml:space="preserve">– </w:t>
+      </w:r>
+      <w:r>
+        <w:rPr>
+          <w:rFonts w:ascii="Times Roman" w:hAnsi="Times Roman"/>
+          <w:b w:val="1"/>
+          <w:bCs w:val="1"/>
+          <w:rtl w:val="0"/>
+          <w:lang w:val="de-DE"/>
+        </w:rPr>
+        <w:t>OFAC)</w:t>
+      </w:r>
+      <w:r>
+        <w:rPr>
+          <w:rFonts w:ascii="Times Roman" w:cs="Times Roman" w:hAnsi="Times Roman" w:eastAsia="Times Roman"/>
+        </w:rPr>
+        <w:br w:type="textWrapping"/>
+      </w:r>
+      <w:r>
+        <w:rPr>
+          <w:rFonts w:ascii="Times Roman" w:hAnsi="Times Roman"/>
+          <w:rtl w:val="0"/>
+          <w:lang w:val="de-DE"/>
+        </w:rPr>
+        <w:t>Full Legal Name: [[nombre_cliente]]</w:t>
+      </w:r>
+      <w:r>
+        <w:rPr>
+          <w:rFonts w:ascii="Times Roman" w:cs="Times Roman" w:hAnsi="Times Roman" w:eastAsia="Times Roman"/>
+        </w:rPr>
+        <w:br w:type="textWrapping"/>
+      </w:r>
+      <w:r>
+        <w:rPr>
+          <w:rFonts w:ascii="Times Roman" w:hAnsi="Times Roman"/>
+          <w:rtl w:val="0"/>
+          <w:lang w:val="de-DE"/>
+        </w:rPr>
+        <w:t>Identification: [[identificacion_cliente]]</w:t>
+      </w:r>
+      <w:r>
+        <w:rPr>
+          <w:rFonts w:ascii="Times Roman" w:cs="Times Roman" w:hAnsi="Times Roman" w:eastAsia="Times Roman"/>
+        </w:rPr>
+        <w:br w:type="textWrapping"/>
+      </w:r>
+      <w:r>
+        <w:rPr>
+          <w:rFonts w:ascii="Times Roman" w:hAnsi="Times Roman"/>
+          <w:rtl w:val="0"/>
+          <w:lang w:val="de-DE"/>
+        </w:rPr>
+        <w:t>Entity Name: [[nombre_entidad]]</w:t>
+      </w:r>
+      <w:r>
+        <w:rPr>
+          <w:rFonts w:ascii="Times Roman" w:cs="Times Roman" w:hAnsi="Times Roman" w:eastAsia="Times Roman"/>
+        </w:rPr>
+        <w:br w:type="textWrapping"/>
+      </w:r>
+      <w:r>
+        <w:rPr>
+          <w:rFonts w:ascii="Times Roman" w:hAnsi="Times Roman"/>
+          <w:rtl w:val="0"/>
+          <w:lang w:val="de-DE"/>
+        </w:rPr>
+        <w:t>Commercial Registration / ONAT License or equivalent: __________________________</w:t>
+      </w:r>
+      <w:r>
+        <w:rPr>
+          <w:rFonts w:ascii="Times Roman" w:cs="Times Roman" w:hAnsi="Times Roman" w:eastAsia="Times Roman"/>
+        </w:rPr>
+        <w:br w:type="textWrapping"/>
+      </w:r>
+      <w:r>
+        <w:rPr>
+          <w:rFonts w:ascii="Times Roman" w:hAnsi="Times Roman"/>
+          <w:rtl w:val="0"/>
+          <w:lang w:val="de-DE"/>
+        </w:rPr>
+        <w:t>Physical Address: [[direccion_cliente]]</w:t>
+      </w:r>
+      <w:r>
+        <w:rPr>
+          <w:rFonts w:ascii="Times Roman" w:cs="Times Roman" w:hAnsi="Times Roman" w:eastAsia="Times Roman"/>
+        </w:rPr>
+        <w:br w:type="textWrapping"/>
+      </w:r>
+      <w:r>
+        <w:rPr>
+          <w:rFonts w:ascii="Times Roman" w:hAnsi="Times Roman"/>
+          <w:rtl w:val="0"/>
+          <w:lang w:val="de-DE"/>
+        </w:rPr>
+        <w:t>Ultimate Beneficial Owners (if applicable): __________________________</w:t>
+      </w:r>
+    </w:p>
+    <w:p>
+      <w:pPr>
+        <w:pStyle w:val="Default"/>
+        <w:suppressAutoHyphens w:val="1"/>
+        <w:spacing w:before="0" w:after="240" w:line="240" w:lineRule="auto"/>
+        <w:jc w:val="left"/>
+        <w:rPr>
+          <w:rFonts w:ascii="Times Roman" w:cs="Times Roman" w:hAnsi="Times Roman" w:eastAsia="Times Roman"/>
+        </w:rPr>
+      </w:pPr>
+      <w:r>
+        <w:rPr>
+          <w:rFonts w:ascii="Times Roman" w:hAnsi="Times Roman"/>
+          <w:rtl w:val="0"/>
+          <w:lang w:val="de-DE"/>
+        </w:rPr>
+        <w:t>Classification:</w:t>
+      </w:r>
+      <w:r>
+        <w:rPr>
+          <w:rFonts w:ascii="Times Roman" w:cs="Times Roman" w:hAnsi="Times Roman" w:eastAsia="Times Roman"/>
+        </w:rPr>
+        <w:br w:type="textWrapping"/>
+      </w:r>
+      <w:r>
+        <w:rPr>
+          <w:rFonts w:ascii="Times Roman" w:hAnsi="Times Roman"/>
+          <w:rtl w:val="0"/>
+          <w:lang w:val="de-DE"/>
+        </w:rPr>
+        <w:t>X Private C1</w:t>
+      </w:r>
+      <w:r>
+        <w:rPr>
+          <w:rFonts w:ascii="Times Roman" w:cs="Times Roman" w:hAnsi="Times Roman" w:eastAsia="Times Roman"/>
+        </w:rPr>
+        <w:br w:type="textWrapping"/>
+      </w:r>
+      <w:r>
+        <w:rPr>
+          <w:rFonts w:ascii="Times Roman" w:hAnsi="Times Roman"/>
+          <w:rtl w:val="0"/>
+          <w:lang w:val="de-DE"/>
+        </w:rPr>
+        <w:t>_ Non-restricted State Entity C2</w:t>
+      </w:r>
+      <w:r>
+        <w:rPr>
+          <w:rFonts w:ascii="Times Roman" w:cs="Times Roman" w:hAnsi="Times Roman" w:eastAsia="Times Roman"/>
+        </w:rPr>
+        <w:br w:type="textWrapping"/>
+      </w:r>
+      <w:r>
+        <w:rPr>
+          <w:rFonts w:ascii="Times Roman" w:hAnsi="Times Roman"/>
+          <w:rtl w:val="0"/>
+          <w:lang w:val="de-DE"/>
+        </w:rPr>
+        <w:t>_ Sensitive State Entity C3</w:t>
+      </w:r>
+    </w:p>
+    <w:p>
+      <w:pPr>
+        <w:pStyle w:val="Default"/>
+        <w:suppressAutoHyphens w:val="1"/>
+        <w:spacing w:before="0" w:after="240" w:line="240" w:lineRule="auto"/>
+        <w:jc w:val="left"/>
+        <w:rPr>
+          <w:rFonts w:ascii="Times Roman" w:cs="Times Roman" w:hAnsi="Times Roman" w:eastAsia="Times Roman"/>
+        </w:rPr>
+      </w:pPr>
+      <w:r>
+        <w:rPr>
+          <w:rFonts w:ascii="Times Roman" w:hAnsi="Times Roman"/>
+          <w:rtl w:val="0"/>
+          <w:lang w:val="de-DE"/>
+        </w:rPr>
+        <w:t>Validations:</w:t>
+      </w:r>
+      <w:r>
+        <w:rPr>
+          <w:rFonts w:ascii="Times Roman" w:cs="Times Roman" w:hAnsi="Times Roman" w:eastAsia="Times Roman"/>
+        </w:rPr>
+        <w:br w:type="textWrapping"/>
+      </w:r>
+      <w:r>
+        <w:rPr>
+          <w:rFonts w:ascii="Times Roman" w:hAnsi="Times Roman"/>
+          <w:rtl w:val="0"/>
+          <w:lang w:val="de-DE"/>
+        </w:rPr>
+        <w:t>X End User identified (MIPYME / TCP)</w:t>
+      </w:r>
+      <w:r>
+        <w:rPr>
+          <w:rFonts w:ascii="Times Roman" w:cs="Times Roman" w:hAnsi="Times Roman" w:eastAsia="Times Roman"/>
+        </w:rPr>
+        <w:br w:type="textWrapping"/>
+      </w:r>
+      <w:r>
+        <w:rPr>
+          <w:rFonts w:ascii="Times Roman" w:hAnsi="Times Roman"/>
+          <w:rtl w:val="0"/>
+          <w:lang w:val="de-DE"/>
+        </w:rPr>
+        <w:t>X End User is NOT a prohibited state entity</w:t>
+      </w:r>
+      <w:r>
+        <w:rPr>
+          <w:rFonts w:ascii="Times Roman" w:cs="Times Roman" w:hAnsi="Times Roman" w:eastAsia="Times Roman"/>
+        </w:rPr>
+        <w:br w:type="textWrapping"/>
+      </w:r>
+      <w:r>
+        <w:rPr>
+          <w:rFonts w:ascii="Times Roman" w:hAnsi="Times Roman"/>
+          <w:rtl w:val="0"/>
+          <w:lang w:val="de-DE"/>
+        </w:rPr>
+        <w:t>X End User is NOT controlled by FAR / MININT / GAESA</w:t>
+      </w:r>
+    </w:p>
+    <w:p>
+      <w:pPr>
+        <w:pStyle w:val="Default"/>
+        <w:suppressAutoHyphens w:val="1"/>
+        <w:spacing w:before="0" w:after="240" w:line="240" w:lineRule="auto"/>
+        <w:jc w:val="left"/>
+        <w:rPr>
+          <w:rFonts w:ascii="Times Roman" w:cs="Times Roman" w:hAnsi="Times Roman" w:eastAsia="Times Roman"/>
+        </w:rPr>
+      </w:pPr>
+      <w:r>
+        <w:rPr>
+          <w:rFonts w:ascii="Times Roman" w:hAnsi="Times Roman"/>
+          <w:rtl w:val="0"/>
+          <w:lang w:val="de-DE"/>
+        </w:rPr>
+        <w:t>Screening performed:</w:t>
+      </w:r>
+      <w:r>
+        <w:rPr>
+          <w:rFonts w:ascii="Times Roman" w:cs="Times Roman" w:hAnsi="Times Roman" w:eastAsia="Times Roman"/>
+        </w:rPr>
+        <w:br w:type="textWrapping"/>
+      </w:r>
+      <w:r>
+        <w:rPr>
+          <w:rFonts w:ascii="Times Roman" w:hAnsi="Times Roman"/>
+          <w:rtl w:val="0"/>
+          <w:lang w:val="de-DE"/>
+        </w:rPr>
+        <w:t>X SDN List</w:t>
+      </w:r>
+      <w:r>
+        <w:rPr>
+          <w:rFonts w:ascii="Times Roman" w:cs="Times Roman" w:hAnsi="Times Roman" w:eastAsia="Times Roman"/>
+        </w:rPr>
+        <w:br w:type="textWrapping"/>
+      </w:r>
+      <w:r>
+        <w:rPr>
+          <w:rFonts w:ascii="Times Roman" w:hAnsi="Times Roman"/>
+          <w:rtl w:val="0"/>
+          <w:lang w:val="de-DE"/>
+        </w:rPr>
+        <w:t>X Cuba Restricted List</w:t>
+      </w:r>
+      <w:r>
+        <w:rPr>
+          <w:rFonts w:ascii="Times Roman" w:cs="Times Roman" w:hAnsi="Times Roman" w:eastAsia="Times Roman"/>
+        </w:rPr>
+        <w:br w:type="textWrapping"/>
+      </w:r>
+      <w:r>
+        <w:rPr>
+          <w:rFonts w:ascii="Times Roman" w:hAnsi="Times Roman"/>
+          <w:rtl w:val="0"/>
+          <w:lang w:val="de-DE"/>
+        </w:rPr>
+        <w:t>X 50 Percent Rule</w:t>
+      </w:r>
+      <w:r>
+        <w:rPr>
+          <w:rFonts w:ascii="Times Roman" w:cs="Times Roman" w:hAnsi="Times Roman" w:eastAsia="Times Roman"/>
+        </w:rPr>
+        <w:br w:type="textWrapping"/>
+      </w:r>
+      <w:r>
+        <w:rPr>
+          <w:rFonts w:ascii="Times Roman" w:hAnsi="Times Roman"/>
+          <w:rtl w:val="0"/>
+          <w:lang w:val="de-DE"/>
+        </w:rPr>
+        <w:t>X Internal lists</w:t>
+      </w:r>
+    </w:p>
+    <w:p>
+      <w:pPr>
+        <w:pStyle w:val="Default"/>
+        <w:suppressAutoHyphens w:val="1"/>
+        <w:spacing w:before="0" w:after="240" w:line="240" w:lineRule="auto"/>
+        <w:jc w:val="left"/>
+        <w:rPr>
+          <w:rFonts w:ascii="Times Roman" w:cs="Times Roman" w:hAnsi="Times Roman" w:eastAsia="Times Roman"/>
+        </w:rPr>
+      </w:pPr>
+      <w:r>
+        <w:rPr>
+          <w:rFonts w:ascii="Times Roman" w:hAnsi="Times Roman"/>
+          <w:rtl w:val="0"/>
+          <w:lang w:val="de-DE"/>
+        </w:rPr>
+        <w:t>X Screening evidence archived (PDF/screenshot)</w:t>
+      </w:r>
+      <w:r>
+        <w:rPr>
+          <w:rFonts w:ascii="Times Roman" w:cs="Times Roman" w:hAnsi="Times Roman" w:eastAsia="Times Roman"/>
+        </w:rPr>
+        <w:br w:type="textWrapping"/>
+      </w:r>
+      <w:r>
+        <w:rPr>
+          <w:rFonts w:ascii="Times Roman" w:hAnsi="Times Roman"/>
+          <w:rtl w:val="0"/>
+          <w:lang w:val="de-DE"/>
+        </w:rPr>
+        <w:t>X End User / End Use Declaration signed</w:t>
+      </w:r>
+    </w:p>
+    <w:p>
+      <w:pPr>
+        <w:pStyle w:val="Default"/>
+        <w:suppressAutoHyphens w:val="1"/>
+        <w:spacing w:before="0" w:after="240" w:line="240" w:lineRule="auto"/>
+        <w:jc w:val="left"/>
+        <w:rPr>
+          <w:rFonts w:ascii="Times Roman" w:cs="Times Roman" w:hAnsi="Times Roman" w:eastAsia="Times Roman"/>
+          <w:b w:val="1"/>
+          <w:bCs w:val="1"/>
+        </w:rPr>
+      </w:pPr>
+    </w:p>
+    <w:p>
+      <w:pPr>
+        <w:pStyle w:val="Default"/>
+        <w:suppressAutoHyphens w:val="1"/>
+        <w:spacing w:before="0" w:after="240" w:line="240" w:lineRule="auto"/>
+        <w:jc w:val="left"/>
+        <w:rPr>
+          <w:rFonts w:ascii="Times Roman" w:cs="Times Roman" w:hAnsi="Times Roman" w:eastAsia="Times Roman"/>
+          <w:b w:val="1"/>
+          <w:bCs w:val="1"/>
+        </w:rPr>
+      </w:pPr>
+      <w:r>
+        <w:rPr>
+          <w:rFonts w:ascii="Times Roman" w:hAnsi="Times Roman"/>
+          <w:b w:val="1"/>
+          <w:bCs w:val="1"/>
+          <w:rtl w:val="0"/>
+          <w:lang w:val="de-DE"/>
+        </w:rPr>
+        <w:t>PRODUCT AND BIS / EAR CLASSIFICATION</w:t>
+      </w:r>
+    </w:p>
+    <w:p>
+      <w:pPr>
+        <w:pStyle w:val="Default"/>
+        <w:suppressAutoHyphens w:val="1"/>
+        <w:spacing w:before="0" w:after="240" w:line="240" w:lineRule="auto"/>
+        <w:jc w:val="left"/>
+        <w:rPr>
+          <w:rFonts w:ascii="Times Roman" w:cs="Times Roman" w:hAnsi="Times Roman" w:eastAsia="Times Roman"/>
+        </w:rPr>
+      </w:pPr>
+      <w:r>
+        <w:rPr>
+          <w:rFonts w:ascii="Times Roman" w:hAnsi="Times Roman"/>
+          <w:rtl w:val="0"/>
+          <w:lang w:val="de-DE"/>
+        </w:rPr>
+        <w:t>PRODUCTS:</w:t>
+      </w:r>
+    </w:p>
+    <w:p>
+      <w:pPr>
+        <w:pStyle w:val="Default"/>
+        <w:suppressAutoHyphens w:val="1"/>
+        <w:spacing w:before="0" w:after="240" w:line="240" w:lineRule="auto"/>
+        <w:jc w:val="left"/>
+        <w:rPr>
+          <w:rFonts w:ascii="Times Roman" w:cs="Times Roman" w:hAnsi="Times Roman" w:eastAsia="Times Roman"/>
+        </w:rPr>
+      </w:pPr>
+      <w:r>
+        <w:rPr>
+          <w:rFonts w:ascii="Times Roman" w:hAnsi="Times Roman"/>
+          <w:rtl w:val="0"/>
+          <w:lang w:val="de-DE"/>
+        </w:rPr>
+        <w:t>[[#productos]]</w:t>
+      </w:r>
+      <w:r>
+        <w:rPr>
+          <w:rFonts w:ascii="Times Roman" w:cs="Times Roman" w:hAnsi="Times Roman" w:eastAsia="Times Roman"/>
+        </w:rPr>
+        <w:br w:type="textWrapping"/>
+      </w:r>
+      <w:r>
+        <w:rPr>
+          <w:rFonts w:ascii="Times Roman" w:hAnsi="Times Roman"/>
+          <w:rtl w:val="0"/>
+          <w:lang w:val="de-DE"/>
+        </w:rPr>
+        <w:t>[[numero]]. Product Name: [[nombre]]</w:t>
+      </w:r>
+      <w:r>
+        <w:rPr>
+          <w:rFonts w:ascii="Times Roman" w:cs="Times Roman" w:hAnsi="Times Roman" w:eastAsia="Times Roman"/>
+        </w:rPr>
+        <w:br w:type="textWrapping"/>
+      </w:r>
+      <w:r>
+        <w:rPr>
+          <w:rFonts w:ascii="Times Roman" w:hAnsi="Times Roman"/>
+          <w:rtl w:val="0"/>
+          <w:lang w:val="de-DE"/>
+        </w:rPr>
+        <w:t>Clear Description: [[descripcion]]</w:t>
+      </w:r>
+      <w:r>
+        <w:rPr>
+          <w:rFonts w:ascii="Times Roman" w:cs="Times Roman" w:hAnsi="Times Roman" w:eastAsia="Times Roman"/>
+        </w:rPr>
+        <w:br w:type="textWrapping"/>
+      </w:r>
+      <w:r>
+        <w:rPr>
+          <w:rFonts w:ascii="Times Roman" w:hAnsi="Times Roman"/>
+          <w:rtl w:val="0"/>
+          <w:lang w:val="de-DE"/>
+        </w:rPr>
+        <w:t>Declared Intended Use: [[uso_previsto]]</w:t>
+      </w:r>
+    </w:p>
+    <w:p>
+      <w:pPr>
+        <w:pStyle w:val="Default"/>
+        <w:suppressAutoHyphens w:val="1"/>
+        <w:spacing w:before="0" w:after="240" w:line="240" w:lineRule="auto"/>
+        <w:jc w:val="left"/>
+        <w:rPr>
+          <w:rFonts w:ascii="Times Roman" w:cs="Times Roman" w:hAnsi="Times Roman" w:eastAsia="Times Roman"/>
+        </w:rPr>
+      </w:pPr>
+      <w:r>
+        <w:rPr>
+          <w:rFonts w:ascii="Times Roman" w:hAnsi="Times Roman"/>
+          <w:rtl w:val="0"/>
+          <w:lang w:val="de-DE"/>
+        </w:rPr>
+        <w:t>Technical Data Sheet / MSDS attached: X Yes _ No</w:t>
+      </w:r>
+      <w:r>
+        <w:rPr>
+          <w:rFonts w:ascii="Times Roman" w:cs="Times Roman" w:hAnsi="Times Roman" w:eastAsia="Times Roman"/>
+        </w:rPr>
+        <w:br w:type="textWrapping"/>
+      </w:r>
+      <w:r>
+        <w:rPr>
+          <w:rFonts w:ascii="Times Roman" w:hAnsi="Times Roman"/>
+          <w:rtl w:val="0"/>
+          <w:lang w:val="de-DE"/>
+        </w:rPr>
+        <w:t>Classification:</w:t>
+      </w:r>
+      <w:r>
+        <w:rPr>
+          <w:rFonts w:ascii="Times Roman" w:cs="Times Roman" w:hAnsi="Times Roman" w:eastAsia="Times Roman"/>
+        </w:rPr>
+        <w:br w:type="textWrapping"/>
+      </w:r>
+      <w:r>
+        <w:rPr>
+          <w:rFonts w:ascii="Times Roman" w:hAnsi="Times Roman"/>
+          <w:rtl w:val="0"/>
+          <w:lang w:val="de-DE"/>
+        </w:rPr>
+        <w:t>X ECCN: EAR99</w:t>
+      </w:r>
+    </w:p>
+    <w:p>
+      <w:pPr>
+        <w:pStyle w:val="Default"/>
+        <w:suppressAutoHyphens w:val="1"/>
+        <w:spacing w:before="0" w:after="240" w:line="240" w:lineRule="auto"/>
+        <w:jc w:val="left"/>
+        <w:rPr>
+          <w:rFonts w:ascii="Times Roman" w:cs="Times Roman" w:hAnsi="Times Roman" w:eastAsia="Times Roman"/>
+        </w:rPr>
+      </w:pPr>
+      <w:r>
+        <w:rPr>
+          <w:rFonts w:ascii="Times Roman" w:hAnsi="Times Roman"/>
+          <w:rtl w:val="0"/>
+          <w:lang w:val="de-DE"/>
+        </w:rPr>
+        <w:t>Validations:</w:t>
+      </w:r>
+      <w:r>
+        <w:rPr>
+          <w:rFonts w:ascii="Times Roman" w:cs="Times Roman" w:hAnsi="Times Roman" w:eastAsia="Times Roman"/>
+        </w:rPr>
+        <w:br w:type="textWrapping"/>
+      </w:r>
+      <w:r>
+        <w:rPr>
+          <w:rFonts w:ascii="Times Roman" w:hAnsi="Times Roman"/>
+          <w:rtl w:val="0"/>
+          <w:lang w:val="de-DE"/>
+        </w:rPr>
+        <w:t>X Product is NOT sensitive dual-use</w:t>
+      </w:r>
+      <w:r>
+        <w:rPr>
+          <w:rFonts w:ascii="Times Roman" w:cs="Times Roman" w:hAnsi="Times Roman" w:eastAsia="Times Roman"/>
+        </w:rPr>
+        <w:br w:type="textWrapping"/>
+      </w:r>
+      <w:r>
+        <w:rPr>
+          <w:rFonts w:ascii="Times Roman" w:hAnsi="Times Roman"/>
+          <w:rtl w:val="0"/>
+          <w:lang w:val="de-DE"/>
+        </w:rPr>
+        <w:t>X Product is NOT prohibited for Cuba</w:t>
+      </w:r>
+      <w:r>
+        <w:rPr>
+          <w:rFonts w:ascii="Times Roman" w:cs="Times Roman" w:hAnsi="Times Roman" w:eastAsia="Times Roman"/>
+        </w:rPr>
+        <w:br w:type="textWrapping"/>
+      </w:r>
+      <w:r>
+        <w:rPr>
+          <w:rFonts w:ascii="Times Roman" w:hAnsi="Times Roman"/>
+          <w:rtl w:val="0"/>
+          <w:lang w:val="de-DE"/>
+        </w:rPr>
+        <w:t>X EAR/BIS validation completed</w:t>
+      </w:r>
+      <w:r>
+        <w:rPr>
+          <w:rFonts w:ascii="Times Roman" w:cs="Times Roman" w:hAnsi="Times Roman" w:eastAsia="Times Roman"/>
+        </w:rPr>
+        <w:br w:type="textWrapping"/>
+      </w:r>
+      <w:r>
+        <w:rPr>
+          <w:rFonts w:ascii="Times Roman" w:hAnsi="Times Roman"/>
+          <w:rtl w:val="0"/>
+          <w:lang w:val="de-DE"/>
+        </w:rPr>
+        <w:t>X Intended use (END USE) documented</w:t>
+      </w:r>
+      <w:r>
+        <w:rPr>
+          <w:rFonts w:ascii="Times Roman" w:cs="Times Roman" w:hAnsi="Times Roman" w:eastAsia="Times Roman"/>
+        </w:rPr>
+        <w:br w:type="textWrapping"/>
+      </w:r>
+      <w:r>
+        <w:rPr>
+          <w:rFonts w:ascii="Times Roman" w:hAnsi="Times Roman"/>
+          <w:rtl w:val="0"/>
+          <w:lang w:val="de-DE"/>
+        </w:rPr>
+        <w:t xml:space="preserve">X Product </w:t>
+      </w:r>
+      <w:r>
+        <w:rPr>
+          <w:rFonts w:ascii="Arial Unicode MS" w:cs="Arial Unicode MS" w:hAnsi="Arial Unicode MS" w:eastAsia="Arial Unicode MS" w:hint="default"/>
+          <w:b w:val="0"/>
+          <w:bCs w:val="0"/>
+          <w:i w:val="0"/>
+          <w:iCs w:val="0"/>
+          <w:rtl w:val="0"/>
+          <w:lang w:val="de-DE"/>
+        </w:rPr>
+        <w:t>↔</w:t>
+      </w:r>
+      <w:r>
+        <w:rPr>
+          <w:rFonts w:ascii="Times Roman" w:hAnsi="Times Roman"/>
+          <w:rtl w:val="0"/>
+          <w:lang w:val="de-DE"/>
+        </w:rPr>
+        <w:t xml:space="preserve"> </w:t>
+      </w:r>
+      <w:r>
+        <w:rPr>
+          <w:rFonts w:ascii="Times Roman" w:hAnsi="Times Roman"/>
+          <w:rtl w:val="0"/>
+          <w:lang w:val="de-DE"/>
+        </w:rPr>
+        <w:t>End User relationship verified</w:t>
+      </w:r>
+      <w:r>
+        <w:rPr>
+          <w:rFonts w:ascii="Times Roman" w:cs="Times Roman" w:hAnsi="Times Roman" w:eastAsia="Times Roman"/>
+        </w:rPr>
+        <w:br w:type="textWrapping"/>
+      </w:r>
+      <w:r>
+        <w:rPr>
+          <w:rFonts w:ascii="Times Roman" w:hAnsi="Times Roman"/>
+          <w:rtl w:val="0"/>
+          <w:lang w:val="de-DE"/>
+        </w:rPr>
+        <w:t>X OFAC payment validations completed</w:t>
+      </w:r>
+    </w:p>
+    <w:p>
+      <w:pPr>
+        <w:pStyle w:val="Default"/>
+        <w:suppressAutoHyphens w:val="1"/>
+        <w:spacing w:before="0" w:after="240" w:line="240" w:lineRule="auto"/>
+        <w:jc w:val="left"/>
+        <w:rPr>
+          <w:rFonts w:ascii="Times Roman" w:cs="Times Roman" w:hAnsi="Times Roman" w:eastAsia="Times Roman"/>
+        </w:rPr>
+      </w:pPr>
+      <w:r>
+        <w:rPr>
+          <w:rFonts w:ascii="Times Roman" w:hAnsi="Times Roman"/>
+          <w:rtl w:val="0"/>
+          <w:lang w:val="de-DE"/>
+        </w:rPr>
+        <w:t>[[/productos]]</w:t>
+      </w:r>
+    </w:p>
+    <w:p>
+      <w:pPr>
+        <w:pStyle w:val="Default"/>
+        <w:suppressAutoHyphens w:val="1"/>
+        <w:spacing w:before="0" w:after="240" w:line="240" w:lineRule="auto"/>
+        <w:jc w:val="left"/>
+        <w:rPr>
+          <w:rFonts w:ascii="Times Roman" w:cs="Times Roman" w:hAnsi="Times Roman" w:eastAsia="Times Roman"/>
+        </w:rPr>
+      </w:pPr>
+      <w:r>
+        <w:rPr>
+          <w:rFonts w:ascii="Times Roman" w:hAnsi="Times Roman"/>
+          <w:b w:val="1"/>
+          <w:bCs w:val="1"/>
+          <w:rtl w:val="0"/>
+          <w:lang w:val="de-DE"/>
+        </w:rPr>
+        <w:t>BIS LICENSE / AUTHORIZATION</w:t>
+      </w:r>
+      <w:r>
+        <w:rPr>
+          <w:rFonts w:ascii="Times Roman" w:cs="Times Roman" w:hAnsi="Times Roman" w:eastAsia="Times Roman"/>
+        </w:rPr>
+        <w:br w:type="textWrapping"/>
+      </w:r>
+      <w:r>
+        <w:rPr>
+          <w:rFonts w:ascii="Times Roman" w:hAnsi="Times Roman"/>
+          <w:rtl w:val="0"/>
+          <w:lang w:val="de-DE"/>
+        </w:rPr>
+        <w:t>X Operation covered by valid BIS license</w:t>
+      </w:r>
+      <w:r>
+        <w:rPr>
+          <w:rFonts w:ascii="Times Roman" w:cs="Times Roman" w:hAnsi="Times Roman" w:eastAsia="Times Roman"/>
+        </w:rPr>
+        <w:br w:type="textWrapping"/>
+      </w:r>
+      <w:r>
+        <w:rPr>
+          <w:rFonts w:ascii="Times Roman" w:hAnsi="Times Roman"/>
+          <w:rtl w:val="0"/>
+          <w:lang w:val="de-DE"/>
+        </w:rPr>
+        <w:t>License Number: __________________</w:t>
+      </w:r>
+    </w:p>
+    <w:p>
+      <w:pPr>
+        <w:pStyle w:val="Default"/>
+        <w:suppressAutoHyphens w:val="1"/>
+        <w:spacing w:before="0" w:after="240" w:line="240" w:lineRule="auto"/>
+        <w:jc w:val="left"/>
+        <w:rPr>
+          <w:rFonts w:ascii="Times Roman" w:cs="Times Roman" w:hAnsi="Times Roman" w:eastAsia="Times Roman"/>
+        </w:rPr>
+      </w:pPr>
+      <w:r>
+        <w:rPr>
+          <w:rFonts w:ascii="Times Roman" w:hAnsi="Times Roman"/>
+          <w:rtl w:val="0"/>
+          <w:lang w:val="de-DE"/>
+        </w:rPr>
+        <w:t>Scope verified:</w:t>
+      </w:r>
+      <w:r>
+        <w:rPr>
+          <w:rFonts w:ascii="Times Roman" w:cs="Times Roman" w:hAnsi="Times Roman" w:eastAsia="Times Roman"/>
+        </w:rPr>
+        <w:br w:type="textWrapping"/>
+      </w:r>
+      <w:r>
+        <w:rPr>
+          <w:rFonts w:ascii="Times Roman" w:hAnsi="Times Roman"/>
+          <w:rtl w:val="0"/>
+          <w:lang w:val="de-DE"/>
+        </w:rPr>
+        <w:t>X Product type</w:t>
+      </w:r>
+      <w:r>
+        <w:rPr>
+          <w:rFonts w:ascii="Times Roman" w:cs="Times Roman" w:hAnsi="Times Roman" w:eastAsia="Times Roman"/>
+        </w:rPr>
+        <w:br w:type="textWrapping"/>
+      </w:r>
+      <w:r>
+        <w:rPr>
+          <w:rFonts w:ascii="Times Roman" w:hAnsi="Times Roman"/>
+          <w:rtl w:val="0"/>
+          <w:lang w:val="de-DE"/>
+        </w:rPr>
+        <w:t>X Quantity</w:t>
+      </w:r>
+      <w:r>
+        <w:rPr>
+          <w:rFonts w:ascii="Times Roman" w:cs="Times Roman" w:hAnsi="Times Roman" w:eastAsia="Times Roman"/>
+        </w:rPr>
+        <w:br w:type="textWrapping"/>
+      </w:r>
+      <w:r>
+        <w:rPr>
+          <w:rFonts w:ascii="Times Roman" w:hAnsi="Times Roman"/>
+          <w:rtl w:val="0"/>
+          <w:lang w:val="de-DE"/>
+        </w:rPr>
+        <w:t>X Value</w:t>
+      </w:r>
+      <w:r>
+        <w:rPr>
+          <w:rFonts w:ascii="Times Roman" w:cs="Times Roman" w:hAnsi="Times Roman" w:eastAsia="Times Roman"/>
+        </w:rPr>
+        <w:br w:type="textWrapping"/>
+      </w:r>
+      <w:r>
+        <w:rPr>
+          <w:rFonts w:ascii="Times Roman" w:hAnsi="Times Roman"/>
+          <w:rtl w:val="0"/>
+          <w:lang w:val="de-DE"/>
+        </w:rPr>
+        <w:t>X Consignee</w:t>
+      </w:r>
+      <w:r>
+        <w:rPr>
+          <w:rFonts w:ascii="Times Roman" w:cs="Times Roman" w:hAnsi="Times Roman" w:eastAsia="Times Roman"/>
+        </w:rPr>
+        <w:br w:type="textWrapping"/>
+      </w:r>
+      <w:r>
+        <w:rPr>
+          <w:rFonts w:ascii="Times Roman" w:hAnsi="Times Roman"/>
+          <w:rtl w:val="0"/>
+          <w:lang w:val="de-DE"/>
+        </w:rPr>
+        <w:t>X End Use</w:t>
+      </w:r>
+    </w:p>
+    <w:p>
+      <w:pPr>
+        <w:pStyle w:val="Default"/>
+        <w:suppressAutoHyphens w:val="1"/>
+        <w:spacing w:before="0" w:after="240" w:line="240" w:lineRule="auto"/>
+        <w:jc w:val="left"/>
+        <w:rPr>
+          <w:rFonts w:ascii="Times Roman" w:cs="Times Roman" w:hAnsi="Times Roman" w:eastAsia="Times Roman"/>
+        </w:rPr>
+      </w:pPr>
+      <w:r>
+        <w:rPr>
+          <w:rFonts w:ascii="Times Roman" w:hAnsi="Times Roman"/>
+          <w:rtl w:val="0"/>
+          <w:lang w:val="de-DE"/>
+        </w:rPr>
+        <w:t>X License limits not exceeded</w:t>
+      </w:r>
+      <w:r>
+        <w:rPr>
+          <w:rFonts w:ascii="Times Roman" w:cs="Times Roman" w:hAnsi="Times Roman" w:eastAsia="Times Roman"/>
+        </w:rPr>
+        <w:br w:type="textWrapping"/>
+      </w:r>
+      <w:r>
+        <w:rPr>
+          <w:rFonts w:ascii="Times Roman" w:hAnsi="Times Roman"/>
+          <w:rtl w:val="0"/>
+          <w:lang w:val="de-DE"/>
+        </w:rPr>
+        <w:t>X Product description matches license</w:t>
+      </w:r>
+    </w:p>
+    <w:p>
+      <w:pPr>
+        <w:pStyle w:val="Default"/>
+        <w:suppressAutoHyphens w:val="1"/>
+        <w:spacing w:before="0" w:after="240" w:line="240" w:lineRule="auto"/>
+        <w:jc w:val="left"/>
+        <w:rPr>
+          <w:rFonts w:ascii="Times Roman" w:cs="Times Roman" w:hAnsi="Times Roman" w:eastAsia="Times Roman"/>
+        </w:rPr>
+      </w:pPr>
+      <w:r>
+        <w:rPr>
+          <w:rFonts w:ascii="Times Roman" w:hAnsi="Times Roman"/>
+          <w:b w:val="1"/>
+          <w:bCs w:val="1"/>
+          <w:rtl w:val="0"/>
+          <w:lang w:val="de-DE"/>
+        </w:rPr>
+        <w:t xml:space="preserve">OFAC / CACR </w:t>
+      </w:r>
+      <w:r>
+        <w:rPr>
+          <w:rFonts w:ascii="Times Roman" w:hAnsi="Times Roman" w:hint="default"/>
+          <w:b w:val="1"/>
+          <w:bCs w:val="1"/>
+          <w:rtl w:val="0"/>
+          <w:lang w:val="de-DE"/>
+        </w:rPr>
+        <w:t xml:space="preserve">– </w:t>
+      </w:r>
+      <w:r>
+        <w:rPr>
+          <w:rFonts w:ascii="Times Roman" w:hAnsi="Times Roman"/>
+          <w:b w:val="1"/>
+          <w:bCs w:val="1"/>
+          <w:rtl w:val="0"/>
+          <w:lang w:val="de-DE"/>
+        </w:rPr>
+        <w:t>SANCTIONS VALIDATION</w:t>
+      </w:r>
+      <w:r>
+        <w:rPr>
+          <w:rFonts w:ascii="Times Roman" w:cs="Times Roman" w:hAnsi="Times Roman" w:eastAsia="Times Roman"/>
+        </w:rPr>
+        <w:br w:type="textWrapping"/>
+      </w:r>
+      <w:r>
+        <w:rPr>
+          <w:rFonts w:ascii="Times Roman" w:hAnsi="Times Roman"/>
+          <w:rtl w:val="0"/>
+          <w:lang w:val="de-DE"/>
+        </w:rPr>
+        <w:t>X Operation permitted under CACR (31 CFR Part 515)</w:t>
+      </w:r>
+      <w:r>
+        <w:rPr>
+          <w:rFonts w:ascii="Times Roman" w:cs="Times Roman" w:hAnsi="Times Roman" w:eastAsia="Times Roman"/>
+        </w:rPr>
+        <w:br w:type="textWrapping"/>
+      </w:r>
+      <w:r>
+        <w:rPr>
+          <w:rFonts w:ascii="Times Roman" w:hAnsi="Times Roman"/>
+          <w:rtl w:val="0"/>
+          <w:lang w:val="de-DE"/>
+        </w:rPr>
+        <w:t>X Financial flow permitted</w:t>
+      </w:r>
+      <w:r>
+        <w:rPr>
+          <w:rFonts w:ascii="Times Roman" w:cs="Times Roman" w:hAnsi="Times Roman" w:eastAsia="Times Roman"/>
+        </w:rPr>
+        <w:br w:type="textWrapping"/>
+      </w:r>
+      <w:r>
+        <w:rPr>
+          <w:rFonts w:ascii="Times Roman" w:hAnsi="Times Roman"/>
+          <w:rtl w:val="0"/>
+          <w:lang w:val="de-DE"/>
+        </w:rPr>
+        <w:t>X No participation of blocked entities</w:t>
+      </w:r>
+      <w:r>
+        <w:rPr>
+          <w:rFonts w:ascii="Times Roman" w:cs="Times Roman" w:hAnsi="Times Roman" w:eastAsia="Times Roman"/>
+        </w:rPr>
+        <w:br w:type="textWrapping"/>
+      </w:r>
+      <w:r>
+        <w:rPr>
+          <w:rFonts w:ascii="Times Roman" w:hAnsi="Times Roman"/>
+          <w:rtl w:val="0"/>
+          <w:lang w:val="de-DE"/>
+        </w:rPr>
+        <w:t>X No payments to or from Cuban state entities</w:t>
+      </w:r>
+    </w:p>
+    <w:p>
+      <w:pPr>
+        <w:pStyle w:val="Default"/>
+        <w:suppressAutoHyphens w:val="1"/>
+        <w:spacing w:before="0" w:after="240" w:line="240" w:lineRule="auto"/>
+        <w:jc w:val="left"/>
+        <w:rPr>
+          <w:rFonts w:ascii="Times Roman" w:cs="Times Roman" w:hAnsi="Times Roman" w:eastAsia="Times Roman"/>
+        </w:rPr>
+      </w:pPr>
+      <w:r>
+        <w:rPr>
+          <w:rFonts w:ascii="Times Roman" w:hAnsi="Times Roman"/>
+          <w:rtl w:val="0"/>
+          <w:lang w:val="de-DE"/>
+        </w:rPr>
+        <w:t>X OFAC screening (lists + 50 Percent Rule)</w:t>
+      </w:r>
+      <w:r>
+        <w:rPr>
+          <w:rFonts w:ascii="Times Roman" w:cs="Times Roman" w:hAnsi="Times Roman" w:eastAsia="Times Roman"/>
+        </w:rPr>
+        <w:br w:type="textWrapping"/>
+      </w:r>
+      <w:r>
+        <w:rPr>
+          <w:rFonts w:ascii="Times Roman" w:hAnsi="Times Roman"/>
+          <w:rtl w:val="0"/>
+          <w:lang w:val="de-DE"/>
+        </w:rPr>
+        <w:t>X Ownership structure review completed (50% Rule)</w:t>
+      </w:r>
+    </w:p>
+    <w:p>
+      <w:pPr>
+        <w:pStyle w:val="Default"/>
+        <w:suppressAutoHyphens w:val="1"/>
+        <w:spacing w:before="0" w:after="240" w:line="240" w:lineRule="auto"/>
+        <w:jc w:val="left"/>
+        <w:rPr>
+          <w:rFonts w:ascii="Times Roman" w:cs="Times Roman" w:hAnsi="Times Roman" w:eastAsia="Times Roman"/>
+        </w:rPr>
+      </w:pPr>
+      <w:r>
+        <w:rPr>
+          <w:rFonts w:ascii="Times Roman" w:hAnsi="Times Roman"/>
+          <w:b w:val="1"/>
+          <w:bCs w:val="1"/>
+          <w:rtl w:val="0"/>
+          <w:lang w:val="de-DE"/>
+        </w:rPr>
+        <w:t>MANDATORY COMMERCIAL DOCUMENTATION</w:t>
+      </w:r>
+      <w:r>
+        <w:rPr>
+          <w:rFonts w:ascii="Times Roman" w:cs="Times Roman" w:hAnsi="Times Roman" w:eastAsia="Times Roman"/>
+        </w:rPr>
+        <w:br w:type="textWrapping"/>
+      </w:r>
+      <w:r>
+        <w:rPr>
+          <w:rFonts w:ascii="Times Roman" w:hAnsi="Times Roman"/>
+          <w:rtl w:val="0"/>
+          <w:lang w:val="de-DE"/>
+        </w:rPr>
+        <w:t>X Contract / commercial order</w:t>
+      </w:r>
+      <w:r>
+        <w:rPr>
+          <w:rFonts w:ascii="Times Roman" w:cs="Times Roman" w:hAnsi="Times Roman" w:eastAsia="Times Roman"/>
+        </w:rPr>
+        <w:br w:type="textWrapping"/>
+      </w:r>
+      <w:r>
+        <w:rPr>
+          <w:rFonts w:ascii="Times Roman" w:hAnsi="Times Roman"/>
+          <w:rtl w:val="0"/>
+          <w:lang w:val="de-DE"/>
+        </w:rPr>
+        <w:t>X Correct commercial invoice</w:t>
+      </w:r>
+      <w:r>
+        <w:rPr>
+          <w:rFonts w:ascii="Times Roman" w:cs="Times Roman" w:hAnsi="Times Roman" w:eastAsia="Times Roman"/>
+        </w:rPr>
+        <w:br w:type="textWrapping"/>
+      </w:r>
+      <w:r>
+        <w:rPr>
+          <w:rFonts w:ascii="Times Roman" w:hAnsi="Times Roman"/>
+          <w:rtl w:val="0"/>
+          <w:lang w:val="de-DE"/>
+        </w:rPr>
+        <w:t>X Packing list</w:t>
+      </w:r>
+      <w:r>
+        <w:rPr>
+          <w:rFonts w:ascii="Times Roman" w:cs="Times Roman" w:hAnsi="Times Roman" w:eastAsia="Times Roman"/>
+        </w:rPr>
+        <w:br w:type="textWrapping"/>
+      </w:r>
+      <w:r>
+        <w:rPr>
+          <w:rFonts w:ascii="Times Roman" w:hAnsi="Times Roman"/>
+          <w:rtl w:val="0"/>
+          <w:lang w:val="de-DE"/>
+        </w:rPr>
+        <w:t>X Bill of Lading</w:t>
+      </w:r>
+      <w:r>
+        <w:rPr>
+          <w:rFonts w:ascii="Times Roman" w:cs="Times Roman" w:hAnsi="Times Roman" w:eastAsia="Times Roman"/>
+        </w:rPr>
+        <w:br w:type="textWrapping"/>
+      </w:r>
+      <w:r>
+        <w:rPr>
+          <w:rFonts w:ascii="Times Roman" w:hAnsi="Times Roman"/>
+          <w:rtl w:val="0"/>
+          <w:lang w:val="de-DE"/>
+        </w:rPr>
+        <w:t>X End User / End Use Declaration signed</w:t>
+      </w:r>
+      <w:r>
+        <w:rPr>
+          <w:rFonts w:ascii="Times Roman" w:cs="Times Roman" w:hAnsi="Times Roman" w:eastAsia="Times Roman"/>
+        </w:rPr>
+        <w:br w:type="textWrapping"/>
+      </w:r>
+      <w:r>
+        <w:rPr>
+          <w:rFonts w:ascii="Times Roman" w:hAnsi="Times Roman"/>
+          <w:rtl w:val="0"/>
+          <w:lang w:val="de-DE"/>
+        </w:rPr>
+        <w:t>X Authorization to ZAS as X Agent Seller / _courier / _filing agent</w:t>
+      </w:r>
+      <w:r>
+        <w:rPr>
+          <w:rFonts w:ascii="Times Roman" w:cs="Times Roman" w:hAnsi="Times Roman" w:eastAsia="Times Roman"/>
+        </w:rPr>
+        <w:br w:type="textWrapping"/>
+      </w:r>
+      <w:r>
+        <w:rPr>
+          <w:rFonts w:ascii="Times Roman" w:hAnsi="Times Roman"/>
+          <w:rtl w:val="0"/>
+          <w:lang w:val="de-DE"/>
+        </w:rPr>
+        <w:t>X Operational checklist completed</w:t>
+      </w:r>
+    </w:p>
+    <w:p>
+      <w:pPr>
+        <w:pStyle w:val="Default"/>
+        <w:suppressAutoHyphens w:val="1"/>
+        <w:spacing w:before="0" w:after="240" w:line="240" w:lineRule="auto"/>
+        <w:jc w:val="left"/>
+        <w:rPr>
+          <w:rFonts w:ascii="Times Roman" w:cs="Times Roman" w:hAnsi="Times Roman" w:eastAsia="Times Roman"/>
+        </w:rPr>
+      </w:pPr>
+      <w:r>
+        <w:rPr>
+          <w:rFonts w:ascii="Times Roman" w:hAnsi="Times Roman"/>
+          <w:b w:val="1"/>
+          <w:bCs w:val="1"/>
+          <w:rtl w:val="0"/>
+          <w:lang w:val="de-DE"/>
+        </w:rPr>
+        <w:t>EEI / ITN (WHEN ORIGIN IS USA)</w:t>
+      </w:r>
+      <w:r>
+        <w:rPr>
+          <w:rFonts w:ascii="Times Roman" w:cs="Times Roman" w:hAnsi="Times Roman" w:eastAsia="Times Roman"/>
+        </w:rPr>
+        <w:br w:type="textWrapping"/>
+      </w:r>
+      <w:r>
+        <w:rPr>
+          <w:rFonts w:ascii="Times Roman" w:hAnsi="Times Roman"/>
+          <w:rtl w:val="0"/>
+          <w:lang w:val="de-DE"/>
+        </w:rPr>
+        <w:t>X EEI filed in AES</w:t>
+      </w:r>
+      <w:r>
+        <w:rPr>
+          <w:rFonts w:ascii="Times Roman" w:cs="Times Roman" w:hAnsi="Times Roman" w:eastAsia="Times Roman"/>
+        </w:rPr>
+        <w:br w:type="textWrapping"/>
+      </w:r>
+      <w:r>
+        <w:rPr>
+          <w:rFonts w:ascii="Times Roman" w:hAnsi="Times Roman"/>
+          <w:rtl w:val="0"/>
+          <w:lang w:val="de-DE"/>
+        </w:rPr>
+        <w:t>X ITN obtained</w:t>
+      </w:r>
+      <w:r>
+        <w:rPr>
+          <w:rFonts w:ascii="Times Roman" w:cs="Times Roman" w:hAnsi="Times Roman" w:eastAsia="Times Roman"/>
+        </w:rPr>
+        <w:br w:type="textWrapping"/>
+      </w:r>
+      <w:r>
+        <w:rPr>
+          <w:rFonts w:ascii="Times Roman" w:hAnsi="Times Roman"/>
+          <w:rtl w:val="0"/>
+          <w:lang w:val="de-DE"/>
+        </w:rPr>
+        <w:t>ITN #: __________________</w:t>
+      </w:r>
+    </w:p>
+    <w:p>
+      <w:pPr>
+        <w:pStyle w:val="Default"/>
+        <w:suppressAutoHyphens w:val="1"/>
+        <w:spacing w:before="0" w:after="240" w:line="240" w:lineRule="auto"/>
+        <w:jc w:val="left"/>
+        <w:rPr>
+          <w:rFonts w:ascii="Times Roman" w:cs="Times Roman" w:hAnsi="Times Roman" w:eastAsia="Times Roman"/>
+        </w:rPr>
+      </w:pPr>
+      <w:r>
+        <w:rPr>
+          <w:rFonts w:ascii="Times Roman" w:hAnsi="Times Roman"/>
+          <w:rtl w:val="0"/>
+          <w:lang w:val="de-DE"/>
+        </w:rPr>
+        <w:t>X ITN included in documentation</w:t>
+      </w:r>
+      <w:r>
+        <w:rPr>
+          <w:rFonts w:ascii="Times Roman" w:cs="Times Roman" w:hAnsi="Times Roman" w:eastAsia="Times Roman"/>
+        </w:rPr>
+        <w:br w:type="textWrapping"/>
+      </w:r>
+      <w:r>
+        <w:rPr>
+          <w:rFonts w:ascii="Times Roman" w:hAnsi="Times Roman"/>
+          <w:rtl w:val="0"/>
+          <w:lang w:val="de-DE"/>
+        </w:rPr>
+        <w:t>X Standard BIS statement included:</w:t>
+      </w:r>
+      <w:r>
+        <w:rPr>
+          <w:rFonts w:ascii="Times Roman" w:cs="Times Roman" w:hAnsi="Times Roman" w:eastAsia="Times Roman"/>
+        </w:rPr>
+        <w:br w:type="textWrapping"/>
+      </w:r>
+      <w:r>
+        <w:rPr>
+          <w:rFonts w:ascii="Times Roman" w:hAnsi="Times Roman"/>
+          <w:rtl w:val="0"/>
+          <w:lang w:val="de-DE"/>
+        </w:rPr>
+        <w:t xml:space="preserve">"EEI filed pursuant to EAR </w:t>
+      </w:r>
+      <w:r>
+        <w:rPr>
+          <w:rFonts w:ascii="Times Roman" w:hAnsi="Times Roman" w:hint="default"/>
+          <w:rtl w:val="0"/>
+          <w:lang w:val="de-DE"/>
+        </w:rPr>
+        <w:t>§</w:t>
+      </w:r>
+      <w:r>
+        <w:rPr>
+          <w:rFonts w:ascii="Times Roman" w:hAnsi="Times Roman"/>
+          <w:rtl w:val="0"/>
+          <w:lang w:val="de-DE"/>
+        </w:rPr>
+        <w:t xml:space="preserve">758.1(b)(1) </w:t>
+      </w:r>
+      <w:r>
+        <w:rPr>
+          <w:rFonts w:ascii="Times Roman" w:hAnsi="Times Roman" w:hint="default"/>
+          <w:rtl w:val="0"/>
+          <w:lang w:val="de-DE"/>
+        </w:rPr>
+        <w:t xml:space="preserve">– </w:t>
+      </w:r>
+      <w:r>
+        <w:rPr>
+          <w:rFonts w:ascii="Times Roman" w:hAnsi="Times Roman"/>
+          <w:rtl w:val="0"/>
+          <w:lang w:val="de-DE"/>
+        </w:rPr>
+        <w:t>destination Cuba (E:2)"</w:t>
+      </w:r>
+    </w:p>
+    <w:p>
+      <w:pPr>
+        <w:pStyle w:val="Default"/>
+        <w:suppressAutoHyphens w:val="1"/>
+        <w:spacing w:before="0" w:after="240" w:line="240" w:lineRule="auto"/>
+        <w:jc w:val="left"/>
+        <w:rPr>
+          <w:rFonts w:ascii="Times Roman" w:cs="Times Roman" w:hAnsi="Times Roman" w:eastAsia="Times Roman"/>
+        </w:rPr>
+      </w:pPr>
+      <w:r>
+        <w:rPr>
+          <w:rFonts w:ascii="Times Roman" w:hAnsi="Times Roman"/>
+          <w:b w:val="1"/>
+          <w:bCs w:val="1"/>
+          <w:rtl w:val="0"/>
+          <w:lang w:val="de-DE"/>
+        </w:rPr>
+        <w:t>TRANSPORT AND THIRD PARTIES</w:t>
+      </w:r>
+      <w:r>
+        <w:rPr>
+          <w:rFonts w:ascii="Times Roman" w:cs="Times Roman" w:hAnsi="Times Roman" w:eastAsia="Times Roman"/>
+        </w:rPr>
+        <w:br w:type="textWrapping"/>
+      </w:r>
+      <w:r>
+        <w:rPr>
+          <w:rFonts w:ascii="Times Roman" w:hAnsi="Times Roman"/>
+          <w:rtl w:val="0"/>
+          <w:lang w:val="de-DE"/>
+        </w:rPr>
+        <w:t>X Shipping line / forwarder aligned with BIS procedure</w:t>
+      </w:r>
+      <w:r>
+        <w:rPr>
+          <w:rFonts w:ascii="Times Roman" w:cs="Times Roman" w:hAnsi="Times Roman" w:eastAsia="Times Roman"/>
+        </w:rPr>
+        <w:br w:type="textWrapping"/>
+      </w:r>
+      <w:r>
+        <w:rPr>
+          <w:rFonts w:ascii="Times Roman" w:hAnsi="Times Roman"/>
+          <w:rtl w:val="0"/>
+          <w:lang w:val="de-DE"/>
+        </w:rPr>
+        <w:t>X No shipment without ITN (if applicable)</w:t>
+      </w:r>
+      <w:r>
+        <w:rPr>
+          <w:rFonts w:ascii="Times Roman" w:cs="Times Roman" w:hAnsi="Times Roman" w:eastAsia="Times Roman"/>
+        </w:rPr>
+        <w:br w:type="textWrapping"/>
+      </w:r>
+      <w:r>
+        <w:rPr>
+          <w:rFonts w:ascii="Times Roman" w:hAnsi="Times Roman"/>
+          <w:rtl w:val="0"/>
+          <w:lang w:val="de-DE"/>
+        </w:rPr>
+        <w:t>X Importer in Cuba verified</w:t>
+      </w:r>
+      <w:r>
+        <w:rPr>
+          <w:rFonts w:ascii="Times Roman" w:cs="Times Roman" w:hAnsi="Times Roman" w:eastAsia="Times Roman"/>
+        </w:rPr>
+        <w:br w:type="textWrapping"/>
+      </w:r>
+      <w:r>
+        <w:rPr>
+          <w:rFonts w:ascii="Times Roman" w:hAnsi="Times Roman"/>
+          <w:rtl w:val="0"/>
+          <w:lang w:val="de-DE"/>
+        </w:rPr>
+        <w:t>X No state intervention at destination</w:t>
+      </w:r>
+    </w:p>
+    <w:p>
+      <w:pPr>
+        <w:pStyle w:val="Default"/>
+        <w:suppressAutoHyphens w:val="1"/>
+        <w:spacing w:before="0" w:after="240" w:line="240" w:lineRule="auto"/>
+        <w:jc w:val="left"/>
+        <w:rPr>
+          <w:rFonts w:ascii="Times Roman" w:cs="Times Roman" w:hAnsi="Times Roman" w:eastAsia="Times Roman"/>
+        </w:rPr>
+      </w:pPr>
+      <w:r>
+        <w:rPr>
+          <w:rFonts w:ascii="Times Roman" w:hAnsi="Times Roman"/>
+          <w:rtl w:val="0"/>
+          <w:lang w:val="de-DE"/>
+        </w:rPr>
+        <w:t>Forwarder / Shipping Line: __________________________</w:t>
+      </w:r>
+    </w:p>
+    <w:p>
+      <w:pPr>
+        <w:pStyle w:val="Default"/>
+        <w:suppressAutoHyphens w:val="1"/>
+        <w:spacing w:before="0" w:after="240" w:line="240" w:lineRule="auto"/>
+        <w:jc w:val="left"/>
+        <w:rPr>
+          <w:rFonts w:ascii="Times Roman" w:cs="Times Roman" w:hAnsi="Times Roman" w:eastAsia="Times Roman"/>
+        </w:rPr>
+      </w:pPr>
+      <w:r>
+        <w:rPr>
+          <w:rFonts w:ascii="Times Roman" w:hAnsi="Times Roman"/>
+          <w:b w:val="1"/>
+          <w:bCs w:val="1"/>
+          <w:rtl w:val="0"/>
+          <w:lang w:val="de-DE"/>
+        </w:rPr>
+        <w:t>FINAL APPROVAL</w:t>
+      </w:r>
+      <w:r>
+        <w:rPr>
+          <w:rFonts w:ascii="Times Roman" w:cs="Times Roman" w:hAnsi="Times Roman" w:eastAsia="Times Roman"/>
+        </w:rPr>
+        <w:br w:type="textWrapping"/>
+      </w:r>
+      <w:r>
+        <w:rPr>
+          <w:rFonts w:ascii="Times Roman" w:hAnsi="Times Roman"/>
+          <w:rtl w:val="0"/>
+          <w:lang w:val="de-DE"/>
+        </w:rPr>
+        <w:t>X BIS Compliance review completed</w:t>
+      </w:r>
+      <w:r>
+        <w:rPr>
+          <w:rFonts w:ascii="Times Roman" w:cs="Times Roman" w:hAnsi="Times Roman" w:eastAsia="Times Roman"/>
+        </w:rPr>
+        <w:br w:type="textWrapping"/>
+      </w:r>
+      <w:r>
+        <w:rPr>
+          <w:rFonts w:ascii="Times Roman" w:hAnsi="Times Roman"/>
+          <w:rtl w:val="0"/>
+          <w:lang w:val="de-DE"/>
+        </w:rPr>
+        <w:t>X Formal shipment authorization</w:t>
+      </w:r>
+      <w:r>
+        <w:rPr>
+          <w:rFonts w:ascii="Times Roman" w:cs="Times Roman" w:hAnsi="Times Roman" w:eastAsia="Times Roman"/>
+        </w:rPr>
+        <w:br w:type="textWrapping"/>
+      </w:r>
+      <w:r>
+        <w:rPr>
+          <w:rFonts w:ascii="Times Roman" w:hAnsi="Times Roman"/>
+          <w:rtl w:val="0"/>
+          <w:lang w:val="de-DE"/>
+        </w:rPr>
+        <w:t>X Complete file created</w:t>
+      </w:r>
+    </w:p>
+    <w:p>
+      <w:pPr>
+        <w:pStyle w:val="Default"/>
+        <w:suppressAutoHyphens w:val="1"/>
+        <w:spacing w:before="0" w:after="240" w:line="240" w:lineRule="auto"/>
+        <w:jc w:val="left"/>
+        <w:rPr>
+          <w:rFonts w:ascii="Times Roman" w:cs="Times Roman" w:hAnsi="Times Roman" w:eastAsia="Times Roman"/>
+        </w:rPr>
+      </w:pPr>
+      <w:r>
+        <w:rPr>
+          <w:rFonts w:ascii="Times Roman" w:hAnsi="Times Roman"/>
+          <w:rtl w:val="0"/>
+          <w:lang w:val="de-DE"/>
+        </w:rPr>
+        <w:t>Compliance Signature: __________________</w:t>
+      </w:r>
+      <w:r>
+        <w:rPr>
+          <w:rFonts w:ascii="Times Roman" w:cs="Times Roman" w:hAnsi="Times Roman" w:eastAsia="Times Roman"/>
+        </w:rPr>
+        <w:br w:type="textWrapping"/>
+      </w:r>
+      <w:r>
+        <w:rPr>
+          <w:rFonts w:ascii="Times Roman" w:hAnsi="Times Roman"/>
+          <w:rtl w:val="0"/>
+          <w:lang w:val="de-DE"/>
+        </w:rPr>
+        <w:t>Date: __________________</w:t>
+      </w:r>
+    </w:p>
+    <w:p>
+      <w:pPr>
+        <w:pStyle w:val="Default"/>
+        <w:suppressAutoHyphens w:val="1"/>
+        <w:spacing w:before="0" w:after="240" w:line="240" w:lineRule="auto"/>
+        <w:jc w:val="left"/>
+        <w:rPr>
+          <w:rFonts w:ascii="Times Roman" w:cs="Times Roman" w:hAnsi="Times Roman" w:eastAsia="Times Roman"/>
+        </w:rPr>
+      </w:pPr>
+    </w:p>
+    <w:p>
+      <w:pPr>
+        <w:pStyle w:val="Body"/>
+        <w:spacing w:line="360" w:lineRule="auto"/>
+      </w:pPr>
+      <w:r/>
     </w:p>
     <w:sectPr>
       <w:headerReference w:type="default" r:id="rId4"/>

</xml_diff>

<commit_message>
chore: update document templates (checklist, cierre expediente, enduser/enduse)
Made-with: Cursor
</commit_message>
<xml_diff>
--- a/backend/templates/checklist_template.docx
+++ b/backend/templates/checklist_template.docx
@@ -152,7 +152,7 @@
           <w:rtl w:val="0"/>
           <w:lang w:val="es-ES_tradnl"/>
         </w:rPr>
-        <w:t>Fecha: [[fecha]]</w:t>
+        <w:t xml:space="preserve">Fecha: </w:t>
       </w:r>
       <w:r>
         <w:rPr>
@@ -572,7 +572,35 @@
           <w:rtl w:val="0"/>
           <w:lang w:val="es-ES_tradnl"/>
         </w:rPr>
-        <w:t>n: [[identificacion_cliente]]</w:t>
+        <w:t>n</w:t>
+      </w:r>
+      <w:r>
+        <w:rPr>
+          <w:rtl w:val="0"/>
+          <w:lang w:val="en-US"/>
+        </w:rPr>
+        <w:t>/</w:t>
+      </w:r>
+      <w:r>
+        <w:rPr>
+          <w:rtl w:val="0"/>
+          <w:lang w:val="es-ES_tradnl"/>
+        </w:rPr>
+        <w:t>Registro mercantil /Licencia ONAT u hom</w:t>
+      </w:r>
+      <w:r>
+        <w:rPr>
+          <w:rtl w:val="0"/>
+          <w:lang w:val="es-ES_tradnl"/>
+        </w:rPr>
+        <w:t>ó</w:t>
+      </w:r>
+      <w:r>
+        <w:rPr>
+          <w:rtl w:val="0"/>
+          <w:lang w:val="es-ES_tradnl"/>
+        </w:rPr>
+        <w:t>logo: [[identificacion_cliente]]</w:t>
       </w:r>
       <w:r>
         <w:rPr>
@@ -586,33 +614,6 @@
           <w:lang w:val="es-ES_tradnl"/>
         </w:rPr>
         <w:t>Nombre entidad: [[nombre_entidad]]</w:t>
-      </w:r>
-      <w:r>
-        <w:rPr>
-          <w:lang w:val="es-ES_tradnl"/>
-        </w:rPr>
-        <w:br w:type="textWrapping"/>
-      </w:r>
-      <w:r>
-        <w:rPr>
-          <w:rtl w:val="0"/>
-          <w:lang w:val="es-ES_tradnl"/>
-        </w:rPr>
-        <w:t>Registro mercantil /Licencia ONAT u hom</w:t>
-      </w:r>
-      <w:r>
-        <w:rPr>
-          <w:rtl w:val="0"/>
-          <w:lang w:val="es-ES_tradnl"/>
-        </w:rPr>
-        <w:t>ó</w:t>
-      </w:r>
-      <w:r>
-        <w:rPr>
-          <w:rtl w:val="0"/>
-          <w:lang w:val="es-ES_tradnl"/>
-        </w:rPr>
-        <w:t>logo: __________________________</w:t>
       </w:r>
       <w:r>
         <w:rPr>
@@ -2554,7 +2555,7 @@
           <w:rtl w:val="0"/>
           <w:lang w:val="de-DE"/>
         </w:rPr>
-        <w:t>Date: [[fecha]]</w:t>
+        <w:t xml:space="preserve">Date: </w:t>
       </w:r>
       <w:r>
         <w:rPr>
@@ -2747,7 +2748,23 @@
           <w:rtl w:val="0"/>
           <w:lang w:val="de-DE"/>
         </w:rPr>
-        <w:t>Identification: [[identificacion_cliente]]</w:t>
+        <w:t>Identification</w:t>
+      </w:r>
+      <w:r>
+        <w:rPr>
+          <w:rFonts w:ascii="Times Roman" w:hAnsi="Times Roman"/>
+          <w:rtl w:val="0"/>
+          <w:lang w:val="en-US"/>
+        </w:rPr>
+        <w:t>/</w:t>
+      </w:r>
+      <w:r>
+        <w:rPr>
+          <w:rFonts w:ascii="Times Roman" w:hAnsi="Times Roman"/>
+          <w:rtl w:val="0"/>
+          <w:lang w:val="de-DE"/>
+        </w:rPr>
+        <w:t>Commercial Registration / ONAT License or equivalent: [[identificacion_cliente]]</w:t>
       </w:r>
       <w:r>
         <w:rPr>
@@ -2762,20 +2779,6 @@
           <w:lang w:val="de-DE"/>
         </w:rPr>
         <w:t>Entity Name: [[nombre_entidad]]</w:t>
-      </w:r>
-      <w:r>
-        <w:rPr>
-          <w:rFonts w:ascii="Times Roman" w:cs="Times Roman" w:hAnsi="Times Roman" w:eastAsia="Times Roman"/>
-        </w:rPr>
-        <w:br w:type="textWrapping"/>
-      </w:r>
-      <w:r>
-        <w:rPr>
-          <w:rFonts w:ascii="Times Roman" w:hAnsi="Times Roman"/>
-          <w:rtl w:val="0"/>
-          <w:lang w:val="de-DE"/>
-        </w:rPr>
-        <w:t>Commercial Registration / ONAT License or equivalent: __________________________</w:t>
       </w:r>
       <w:r>
         <w:rPr>
@@ -3518,6 +3521,14 @@
           <w:lang w:val="de-DE"/>
         </w:rPr>
         <w:t>X Product description matches license</w:t>
+      </w:r>
+      <w:r>
+        <w:rPr>
+          <w:rFonts w:ascii="Times Roman" w:hAnsi="Times Roman"/>
+          <w:rtl w:val="0"/>
+          <w:lang w:val="en-US"/>
+        </w:rPr>
+        <w:t>:</w:t>
       </w:r>
     </w:p>
     <w:p>

</xml_diff>

<commit_message>
chore: update checklist document templates
Made-with: Cursor
</commit_message>
<xml_diff>
--- a/backend/templates/checklist_template.docx
+++ b/backend/templates/checklist_template.docx
@@ -2443,6 +2443,28 @@
       <w:pPr>
         <w:pStyle w:val="Body"/>
         <w:spacing w:line="360" w:lineRule="auto"/>
+      </w:pPr>
+    </w:p>
+    <w:p>
+      <w:pPr>
+        <w:pStyle w:val="Default"/>
+        <w:suppressAutoHyphens w:val="1"/>
+        <w:spacing w:before="0" w:after="240" w:line="240" w:lineRule="auto"/>
+        <w:jc w:val="center"/>
+        <w:rPr>
+          <w:rFonts w:ascii="Times Roman" w:cs="Times Roman" w:hAnsi="Times Roman" w:eastAsia="Times Roman"/>
+        </w:rPr>
+      </w:pPr>
+    </w:p>
+    <w:p>
+      <w:pPr>
+        <w:pStyle w:val="Default"/>
+        <w:suppressAutoHyphens w:val="1"/>
+        <w:spacing w:before="0" w:after="240" w:line="240" w:lineRule="auto"/>
+        <w:jc w:val="center"/>
+        <w:rPr>
+          <w:rFonts w:ascii="Times Roman" w:cs="Times Roman" w:hAnsi="Times Roman" w:eastAsia="Times Roman"/>
+        </w:rPr>
       </w:pPr>
     </w:p>
     <w:p>

</xml_diff>

<commit_message>
feat: add checklist template variables ITN and CARRIER
Made-with: Cursor
</commit_message>
<xml_diff>
--- a/backend/templates/checklist_template.docx
+++ b/backend/templates/checklist_template.docx
@@ -2010,7 +2010,23 @@
           <w:rtl w:val="0"/>
           <w:lang w:val="es-ES_tradnl"/>
         </w:rPr>
-        <w:t>ITN #: __________________</w:t>
+        <w:t>ITN #: __</w:t>
+      </w:r>
+      <w:r>
+        <w:rPr>
+          <w:rFonts w:ascii="Times New Roman" w:hAnsi="Times New Roman"/>
+          <w:rtl w:val="0"/>
+          <w:lang w:val="en-US"/>
+        </w:rPr>
+        <w:t>[[ITN]]</w:t>
+      </w:r>
+      <w:r>
+        <w:rPr>
+          <w:rFonts w:ascii="Times New Roman" w:hAnsi="Times New Roman"/>
+          <w:rtl w:val="0"/>
+          <w:lang w:val="es-ES_tradnl"/>
+        </w:rPr>
+        <w:t>___</w:t>
       </w:r>
     </w:p>
     <w:p>
@@ -2221,7 +2237,7 @@
           <w:rtl w:val="0"/>
           <w:lang w:val="es-ES_tradnl"/>
         </w:rPr>
-        <w:t>Forwarder / Naviera: __________________________</w:t>
+        <w:t>Forwarder / Naviera: _____[[CARRIER]]__________</w:t>
       </w:r>
     </w:p>
     <w:p>
@@ -3862,7 +3878,7 @@
           <w:rtl w:val="0"/>
           <w:lang w:val="de-DE"/>
         </w:rPr>
-        <w:t>ITN #: __________________</w:t>
+        <w:t>ITN #: ___ __[[ITN]]______</w:t>
       </w:r>
     </w:p>
     <w:p>
@@ -4037,7 +4053,23 @@
           <w:rtl w:val="0"/>
           <w:lang w:val="de-DE"/>
         </w:rPr>
-        <w:t>Forwarder / Shipping Line: __________________________</w:t>
+        <w:t>Forwarder / Shipping Line: _____[[</w:t>
+      </w:r>
+      <w:r>
+        <w:rPr>
+          <w:rFonts w:ascii="Times Roman" w:hAnsi="Times Roman"/>
+          <w:rtl w:val="0"/>
+          <w:lang w:val="en-US"/>
+        </w:rPr>
+        <w:t>CARRIER</w:t>
+      </w:r>
+      <w:r>
+        <w:rPr>
+          <w:rFonts w:ascii="Times Roman" w:hAnsi="Times Roman"/>
+          <w:rtl w:val="0"/>
+          <w:lang w:val="de-DE"/>
+        </w:rPr>
+        <w:t>]]__________</w:t>
       </w:r>
     </w:p>
     <w:p>

</xml_diff>